<commit_message>
docs(security): mark #5 fixed (tenancy guard) + #8 (cédula out of URL); no residual risks
Co-Authored-By: Claude Fable 5 <noreply@anthropic.com>
</commit_message>
<xml_diff>
--- a/docs/security/Revision-Seguridad-employee-api-spi-v1.0.docx
+++ b/docs/security/Revision-Seguridad-employee-api-spi-v1.0.docx
@@ -412,7 +412,7 @@
                 <w:sz w:val="20"/>
                 <w:szCs w:val="20"/>
               </w:rPr>
-              <w:t xml:space="preserve">6 hallazgos: 5 corregidos, 1 riesgo residual documentado. Requisito P2C (cifrado de payload) implementado.</w:t>
+              <w:t xml:space="preserve">8 hallazgos, todos corregidos y verificados. Requisito P2C (cifrado de payload + cédula fuera de la URL) implementado. Sin riesgos residuales abiertos.</w:t>
             </w:r>
           </w:p>
         </w:tc>
@@ -450,7 +450,7 @@
           <w:sz w:val="22"/>
           <w:szCs w:val="22"/>
         </w:rPr>
-        <w:t xml:space="preserve">Se revisó el servicio Employee API SPI con foco en la confidencialidad de datos personales (cédula/PII), autenticación, autorización y superficie de exposición. La revisión identificó 6 hallazgos; 5 fueron corregidos en esta iteración y 1 queda como riesgo residual de bajo impacto, documentado. Adicionalmente, se implementó el requisito P2C de cifrado de payload extremo front↔back con la librería crypto-js (CryptoJS.AES), compatible con el estándar del portal Farmatodo. Todos los cambios están cubiertos por pruebas automatizadas (79 unitarias + 15 e2e) y verificados en runtime.</w:t>
+        <w:t xml:space="preserve">Se revisó el servicio Employee API SPI con foco en la confidencialidad de datos personales (cédula/PII), autenticación, autorización y superficie de exposición. La revisión identificó 8 hallazgos; todos fueron corregidos y verificados en esta iteración, sin riesgos residuales abiertos. Adicionalmente, se implementó el requisito P2C de cifrado de payload extremo front↔back con la librería crypto-js (CryptoJS.AES), compatible con el estándar del portal Farmatodo, y se movieron todas las operaciones a POST para que la cédula nunca viaje en la URL. Todos los cambios están cubiertos por pruebas automatizadas (78 unitarias + 15 e2e) y verificados en runtime.</w:t>
       </w:r>
     </w:p>
     <w:p>
@@ -548,6 +548,24 @@
           <w:szCs w:val="22"/>
         </w:rPr>
         <w:t xml:space="preserve">Requisito P2C adicional: se implementó cifrado del payload a nivel de aplicación (CryptoJS.AES) para que el body viaje cifrado además del TLS. Ver sección 5.</w:t>
+      </w:r>
+    </w:p>
+    <w:p>
+      <w:pPr>
+        <w:pStyle w:val="ListParagraph"/>
+        <w:numPr>
+          <w:ilvl w:val="0"/>
+          <w:numId w:val="2"/>
+        </w:numPr>
+        <w:spacing w:after="80"/>
+      </w:pPr>
+      <w:r>
+        <w:rPr>
+          <w:rFonts w:ascii="Arial" w:cs="Arial" w:eastAsia="Arial" w:hAnsi="Arial"/>
+          <w:sz w:val="22"/>
+          <w:szCs w:val="22"/>
+        </w:rPr>
+        <w:t xml:space="preserve">La cédula NUNCA viaja en la URL: todas las operaciones (create, search, list, update, delete) usan POST con el identificador en el body cifrable — evita que la cédula quede en access logs, proxies o historiales.</w:t>
       </w:r>
     </w:p>
     <w:p>
@@ -1267,7 +1285,7 @@
                 <w:sz w:val="20"/>
                 <w:szCs w:val="20"/>
               </w:rPr>
-              <w:t xml:space="preserve">La validación de país (middleware) corre antes de la autenticación → un no-autenticado puede enumerar países habilitados (422 vs 401).</w:t>
+              <w:t xml:space="preserve">La validación de país (middleware) corría antes de la autenticación → un no-autenticado podía enumerar países habilitados (422 vs 401).</w:t>
             </w:r>
           </w:p>
         </w:tc>
@@ -1280,6 +1298,67 @@
               <w:bottom w:val="single" w:color="B0B0B0" w:sz="1"/>
               <w:right w:val="single" w:color="B0B0B0" w:sz="1"/>
             </w:tcBorders>
+            <w:tcMar>
+              <w:top w:type="dxa" w:w="80"/>
+              <w:left w:type="dxa" w:w="120"/>
+              <w:bottom w:type="dxa" w:w="80"/>
+              <w:right w:type="dxa" w:w="120"/>
+            </w:tcMar>
+          </w:tcPr>
+          <w:p>
+            <w:r>
+              <w:rPr>
+                <w:rFonts w:ascii="Arial" w:cs="Arial" w:eastAsia="Arial" w:hAnsi="Arial"/>
+                <w:b/>
+                <w:bCs/>
+                <w:color w:val="2E7D32"/>
+                <w:sz w:val="20"/>
+                <w:szCs w:val="20"/>
+              </w:rPr>
+              <w:t xml:space="preserve">Corregido — tenancy convertida a guard; auth corre primero (401 antes de cualquier chequeo de país)</w:t>
+            </w:r>
+          </w:p>
+        </w:tc>
+      </w:tr>
+      <w:tr>
+        <w:tc>
+          <w:tcPr>
+            <w:tcW w:type="dxa" w:w="500"/>
+            <w:tcBorders>
+              <w:top w:val="single" w:color="B0B0B0" w:sz="1"/>
+              <w:left w:val="single" w:color="B0B0B0" w:sz="1"/>
+              <w:bottom w:val="single" w:color="B0B0B0" w:sz="1"/>
+              <w:right w:val="single" w:color="B0B0B0" w:sz="1"/>
+            </w:tcBorders>
+            <w:shd w:fill="F2F2F2" w:val="clear"/>
+            <w:tcMar>
+              <w:top w:type="dxa" w:w="80"/>
+              <w:left w:type="dxa" w:w="120"/>
+              <w:bottom w:type="dxa" w:w="80"/>
+              <w:right w:type="dxa" w:w="120"/>
+            </w:tcMar>
+          </w:tcPr>
+          <w:p>
+            <w:r>
+              <w:rPr>
+                <w:rFonts w:ascii="Arial" w:cs="Arial" w:eastAsia="Arial" w:hAnsi="Arial"/>
+                <w:sz w:val="20"/>
+                <w:szCs w:val="20"/>
+              </w:rPr>
+              <w:t xml:space="preserve">8</w:t>
+            </w:r>
+          </w:p>
+        </w:tc>
+        <w:tc>
+          <w:tcPr>
+            <w:tcW w:type="dxa" w:w="1500"/>
+            <w:tcBorders>
+              <w:top w:val="single" w:color="B0B0B0" w:sz="1"/>
+              <w:left w:val="single" w:color="B0B0B0" w:sz="1"/>
+              <w:bottom w:val="single" w:color="B0B0B0" w:sz="1"/>
+              <w:right w:val="single" w:color="B0B0B0" w:sz="1"/>
+            </w:tcBorders>
+            <w:shd w:fill="F2F2F2" w:val="clear"/>
             <w:tcMar>
               <w:top w:type="dxa" w:w="80"/>
               <w:left w:type="dxa" w:w="120"/>
@@ -1297,7 +1376,66 @@
                 <w:sz w:val="20"/>
                 <w:szCs w:val="20"/>
               </w:rPr>
-              <w:t xml:space="preserve">Residual — documentado; mitigación: convertir tenancy a guard</w:t>
+              <w:t xml:space="preserve">Media</w:t>
+            </w:r>
+          </w:p>
+        </w:tc>
+        <w:tc>
+          <w:tcPr>
+            <w:tcW w:type="dxa" w:w="4360"/>
+            <w:tcBorders>
+              <w:top w:val="single" w:color="B0B0B0" w:sz="1"/>
+              <w:left w:val="single" w:color="B0B0B0" w:sz="1"/>
+              <w:bottom w:val="single" w:color="B0B0B0" w:sz="1"/>
+              <w:right w:val="single" w:color="B0B0B0" w:sz="1"/>
+            </w:tcBorders>
+            <w:shd w:fill="F2F2F2" w:val="clear"/>
+            <w:tcMar>
+              <w:top w:type="dxa" w:w="80"/>
+              <w:left w:type="dxa" w:w="120"/>
+              <w:bottom w:type="dxa" w:w="80"/>
+              <w:right w:type="dxa" w:w="120"/>
+            </w:tcMar>
+          </w:tcPr>
+          <w:p>
+            <w:r>
+              <w:rPr>
+                <w:rFonts w:ascii="Arial" w:cs="Arial" w:eastAsia="Arial" w:hAnsi="Arial"/>
+                <w:sz w:val="20"/>
+                <w:szCs w:val="20"/>
+              </w:rPr>
+              <w:t xml:space="preserve">La cédula viajaba en la URL en las lecturas/escrituras (GET/PUT/DELETE /employees/:id) → quedaba en access logs y proxies.</w:t>
+            </w:r>
+          </w:p>
+        </w:tc>
+        <w:tc>
+          <w:tcPr>
+            <w:tcW w:type="dxa" w:w="3000"/>
+            <w:tcBorders>
+              <w:top w:val="single" w:color="B0B0B0" w:sz="1"/>
+              <w:left w:val="single" w:color="B0B0B0" w:sz="1"/>
+              <w:bottom w:val="single" w:color="B0B0B0" w:sz="1"/>
+              <w:right w:val="single" w:color="B0B0B0" w:sz="1"/>
+            </w:tcBorders>
+            <w:shd w:fill="F2F2F2" w:val="clear"/>
+            <w:tcMar>
+              <w:top w:type="dxa" w:w="80"/>
+              <w:left w:type="dxa" w:w="120"/>
+              <w:bottom w:type="dxa" w:w="80"/>
+              <w:right w:type="dxa" w:w="120"/>
+            </w:tcMar>
+          </w:tcPr>
+          <w:p>
+            <w:r>
+              <w:rPr>
+                <w:rFonts w:ascii="Arial" w:cs="Arial" w:eastAsia="Arial" w:hAnsi="Arial"/>
+                <w:b/>
+                <w:bCs/>
+                <w:color w:val="2E7D32"/>
+                <w:sz w:val="20"/>
+                <w:szCs w:val="20"/>
+              </w:rPr>
+              <w:t xml:space="preserve">Corregido — todas las operaciones por POST con la cédula en el body (Farmatodo P2C)</w:t>
             </w:r>
           </w:p>
         </w:tc>
@@ -1312,7 +1450,6 @@
               <w:bottom w:val="single" w:color="B0B0B0" w:sz="1"/>
               <w:right w:val="single" w:color="B0B0B0" w:sz="1"/>
             </w:tcBorders>
-            <w:shd w:fill="F2F2F2" w:val="clear"/>
             <w:tcMar>
               <w:top w:type="dxa" w:w="80"/>
               <w:left w:type="dxa" w:w="120"/>
@@ -1340,7 +1477,6 @@
               <w:bottom w:val="single" w:color="B0B0B0" w:sz="1"/>
               <w:right w:val="single" w:color="B0B0B0" w:sz="1"/>
             </w:tcBorders>
-            <w:shd w:fill="F2F2F2" w:val="clear"/>
             <w:tcMar>
               <w:top w:type="dxa" w:w="80"/>
               <w:left w:type="dxa" w:w="120"/>
@@ -1371,7 +1507,6 @@
               <w:bottom w:val="single" w:color="B0B0B0" w:sz="1"/>
               <w:right w:val="single" w:color="B0B0B0" w:sz="1"/>
             </w:tcBorders>
-            <w:shd w:fill="F2F2F2" w:val="clear"/>
             <w:tcMar>
               <w:top w:type="dxa" w:w="80"/>
               <w:left w:type="dxa" w:w="120"/>
@@ -1399,7 +1534,6 @@
               <w:bottom w:val="single" w:color="B0B0B0" w:sz="1"/>
               <w:right w:val="single" w:color="B0B0B0" w:sz="1"/>
             </w:tcBorders>
-            <w:shd w:fill="F2F2F2" w:val="clear"/>
             <w:tcMar>
               <w:top w:type="dxa" w:w="80"/>
               <w:left w:type="dxa" w:w="120"/>
@@ -1432,6 +1566,7 @@
               <w:bottom w:val="single" w:color="B0B0B0" w:sz="1"/>
               <w:right w:val="single" w:color="B0B0B0" w:sz="1"/>
             </w:tcBorders>
+            <w:shd w:fill="F2F2F2" w:val="clear"/>
             <w:tcMar>
               <w:top w:type="dxa" w:w="80"/>
               <w:left w:type="dxa" w:w="120"/>
@@ -1459,6 +1594,7 @@
               <w:bottom w:val="single" w:color="B0B0B0" w:sz="1"/>
               <w:right w:val="single" w:color="B0B0B0" w:sz="1"/>
             </w:tcBorders>
+            <w:shd w:fill="F2F2F2" w:val="clear"/>
             <w:tcMar>
               <w:top w:type="dxa" w:w="80"/>
               <w:left w:type="dxa" w:w="120"/>
@@ -1489,6 +1625,7 @@
               <w:bottom w:val="single" w:color="B0B0B0" w:sz="1"/>
               <w:right w:val="single" w:color="B0B0B0" w:sz="1"/>
             </w:tcBorders>
+            <w:shd w:fill="F2F2F2" w:val="clear"/>
             <w:tcMar>
               <w:top w:type="dxa" w:w="80"/>
               <w:left w:type="dxa" w:w="120"/>
@@ -1516,6 +1653,7 @@
               <w:bottom w:val="single" w:color="B0B0B0" w:sz="1"/>
               <w:right w:val="single" w:color="B0B0B0" w:sz="1"/>
             </w:tcBorders>
+            <w:shd w:fill="F2F2F2" w:val="clear"/>
             <w:tcMar>
               <w:top w:type="dxa" w:w="80"/>
               <w:left w:type="dxa" w:w="120"/>
@@ -1748,7 +1886,121 @@
                 <w:sz w:val="20"/>
                 <w:szCs w:val="20"/>
               </w:rPr>
-              <w:t xml:space="preserve">Guard valida claim countries vs X-Country-Code → 403</w:t>
+              <w:t xml:space="preserve">Guard (post-auth) valida claim countries vs X-Country-Code → 403</w:t>
+            </w:r>
+          </w:p>
+        </w:tc>
+      </w:tr>
+      <w:tr>
+        <w:tc>
+          <w:tcPr>
+            <w:tcW w:type="dxa" w:w="2900"/>
+            <w:tcBorders>
+              <w:top w:val="single" w:color="B0B0B0" w:sz="1"/>
+              <w:left w:val="single" w:color="B0B0B0" w:sz="1"/>
+              <w:bottom w:val="single" w:color="B0B0B0" w:sz="1"/>
+              <w:right w:val="single" w:color="B0B0B0" w:sz="1"/>
+            </w:tcBorders>
+            <w:tcMar>
+              <w:top w:type="dxa" w:w="80"/>
+              <w:left w:type="dxa" w:w="120"/>
+              <w:bottom w:type="dxa" w:w="80"/>
+              <w:right w:type="dxa" w:w="120"/>
+            </w:tcMar>
+          </w:tcPr>
+          <w:p>
+            <w:r>
+              <w:rPr>
+                <w:rFonts w:ascii="Arial" w:cs="Arial" w:eastAsia="Arial" w:hAnsi="Arial"/>
+                <w:sz w:val="20"/>
+                <w:szCs w:val="20"/>
+              </w:rPr>
+              <w:t xml:space="preserve">Cédula fuera de la URL</w:t>
+            </w:r>
+          </w:p>
+        </w:tc>
+        <w:tc>
+          <w:tcPr>
+            <w:tcW w:type="dxa" w:w="6460"/>
+            <w:tcBorders>
+              <w:top w:val="single" w:color="B0B0B0" w:sz="1"/>
+              <w:left w:val="single" w:color="B0B0B0" w:sz="1"/>
+              <w:bottom w:val="single" w:color="B0B0B0" w:sz="1"/>
+              <w:right w:val="single" w:color="B0B0B0" w:sz="1"/>
+            </w:tcBorders>
+            <w:tcMar>
+              <w:top w:type="dxa" w:w="80"/>
+              <w:left w:type="dxa" w:w="120"/>
+              <w:bottom w:type="dxa" w:w="80"/>
+              <w:right w:type="dxa" w:w="120"/>
+            </w:tcMar>
+          </w:tcPr>
+          <w:p>
+            <w:r>
+              <w:rPr>
+                <w:rFonts w:ascii="Arial" w:cs="Arial" w:eastAsia="Arial" w:hAnsi="Arial"/>
+                <w:sz w:val="20"/>
+                <w:szCs w:val="20"/>
+              </w:rPr>
+              <w:t xml:space="preserve">Todas las operaciones por POST con el identificador en el body (no en la URL → no en logs)</w:t>
+            </w:r>
+          </w:p>
+        </w:tc>
+      </w:tr>
+      <w:tr>
+        <w:tc>
+          <w:tcPr>
+            <w:tcW w:type="dxa" w:w="2900"/>
+            <w:tcBorders>
+              <w:top w:val="single" w:color="B0B0B0" w:sz="1"/>
+              <w:left w:val="single" w:color="B0B0B0" w:sz="1"/>
+              <w:bottom w:val="single" w:color="B0B0B0" w:sz="1"/>
+              <w:right w:val="single" w:color="B0B0B0" w:sz="1"/>
+            </w:tcBorders>
+            <w:shd w:fill="F2F2F2" w:val="clear"/>
+            <w:tcMar>
+              <w:top w:type="dxa" w:w="80"/>
+              <w:left w:type="dxa" w:w="120"/>
+              <w:bottom w:type="dxa" w:w="80"/>
+              <w:right w:type="dxa" w:w="120"/>
+            </w:tcMar>
+          </w:tcPr>
+          <w:p>
+            <w:r>
+              <w:rPr>
+                <w:rFonts w:ascii="Arial" w:cs="Arial" w:eastAsia="Arial" w:hAnsi="Arial"/>
+                <w:sz w:val="20"/>
+                <w:szCs w:val="20"/>
+              </w:rPr>
+              <w:t xml:space="preserve">Orden de guards</w:t>
+            </w:r>
+          </w:p>
+        </w:tc>
+        <w:tc>
+          <w:tcPr>
+            <w:tcW w:type="dxa" w:w="6460"/>
+            <w:tcBorders>
+              <w:top w:val="single" w:color="B0B0B0" w:sz="1"/>
+              <w:left w:val="single" w:color="B0B0B0" w:sz="1"/>
+              <w:bottom w:val="single" w:color="B0B0B0" w:sz="1"/>
+              <w:right w:val="single" w:color="B0B0B0" w:sz="1"/>
+            </w:tcBorders>
+            <w:shd w:fill="F2F2F2" w:val="clear"/>
+            <w:tcMar>
+              <w:top w:type="dxa" w:w="80"/>
+              <w:left w:type="dxa" w:w="120"/>
+              <w:bottom w:type="dxa" w:w="80"/>
+              <w:right w:type="dxa" w:w="120"/>
+            </w:tcMar>
+          </w:tcPr>
+          <w:p>
+            <w:r>
+              <w:rPr>
+                <w:rFonts w:ascii="Arial" w:cs="Arial" w:eastAsia="Arial" w:hAnsi="Arial"/>
+                <w:sz w:val="20"/>
+                <w:szCs w:val="20"/>
+              </w:rPr>
+              <w:t xml:space="preserve">rate-limit → autenticación → país; no-autenticado recibe 401 antes de cualquier chequeo</w:t>
             </w:r>
           </w:p>
         </w:tc>
@@ -2440,7 +2692,7 @@
           <w:sz w:val="28"/>
           <w:szCs w:val="28"/>
         </w:rPr>
-        <w:t xml:space="preserve">6. Riesgo residual</w:t>
+        <w:t xml:space="preserve">6. Riesgos residuales</w:t>
       </w:r>
     </w:p>
     <w:p>
@@ -2453,7 +2705,291 @@
           <w:sz w:val="22"/>
           <w:szCs w:val="22"/>
         </w:rPr>
-        <w:t xml:space="preserve">Hallazgo #5 (severidad media): la validación del header X-Country-Code está en un middleware, que en NestJS se ejecuta antes de la autenticación. Un llamante no autenticado con un header de país inválido recibe 400/422 antes que 401, lo que permite enumerar qué países están habilitados.</w:t>
+        <w:t xml:space="preserve">No quedan riesgos residuales abiertos de esta revisión. El hallazgo #5 (enumeración de países pre-autenticación) fue corregido: la validación de país se movió de middleware a un guard que corre DESPUÉS de la autenticación, por lo que un llamante no autenticado recibe 401 antes de cualquier chequeo de país (verificado en runtime). Se mantienen como buenas prácticas continuas las recomendaciones de la sección 8 (rotación de llaves, TDE, despliegue siempre detrás de TLS).</w:t>
+      </w:r>
+    </w:p>
+    <w:p>
+      <w:pPr>
+        <w:pStyle w:val="Heading1"/>
+        <w:spacing w:after="140" w:before="280"/>
+      </w:pPr>
+      <w:r>
+        <w:rPr>
+          <w:rFonts w:ascii="Arial" w:cs="Arial" w:eastAsia="Arial" w:hAnsi="Arial"/>
+          <w:b/>
+          <w:bCs/>
+          <w:color w:val="002858"/>
+          <w:sz w:val="28"/>
+          <w:szCs w:val="28"/>
+        </w:rPr>
+        <w:t xml:space="preserve">7. Evidencia de verificación</w:t>
+      </w:r>
+    </w:p>
+    <w:p>
+      <w:pPr>
+        <w:spacing w:after="120"/>
+      </w:pPr>
+      <w:r>
+        <w:rPr>
+          <w:rFonts w:ascii="Arial" w:cs="Arial" w:eastAsia="Arial" w:hAnsi="Arial"/>
+          <w:sz w:val="22"/>
+          <w:szCs w:val="22"/>
+        </w:rPr>
+        <w:t xml:space="preserve">Verificado en runtime y por pruebas automatizadas:</w:t>
+      </w:r>
+    </w:p>
+    <w:p>
+      <w:pPr>
+        <w:shd w:fill="1E1E2E" w:val="clear"/>
+        <w:spacing w:after="0"/>
+        <w:ind w:left="160"/>
+      </w:pPr>
+      <w:r>
+        <w:rPr>
+          <w:rFonts w:ascii="Consolas" w:cs="Consolas" w:eastAsia="Consolas" w:hAnsi="Consolas"/>
+          <w:color w:val="D8F0D8"/>
+          <w:sz w:val="17"/>
+          <w:szCs w:val="17"/>
+        </w:rPr>
+        <w:t xml:space="preserve"># Cabeceras de seguridad (helmet)</w:t>
+      </w:r>
+    </w:p>
+    <w:p>
+      <w:pPr>
+        <w:shd w:fill="1E1E2E" w:val="clear"/>
+        <w:spacing w:after="0"/>
+        <w:ind w:left="160"/>
+      </w:pPr>
+      <w:r>
+        <w:rPr>
+          <w:rFonts w:ascii="Consolas" w:cs="Consolas" w:eastAsia="Consolas" w:hAnsi="Consolas"/>
+          <w:color w:val="D8F0D8"/>
+          <w:sz w:val="17"/>
+          <w:szCs w:val="17"/>
+        </w:rPr>
+        <w:t xml:space="preserve">Strict-Transport-Security: max-age=31536000; includeSubDomains; preload</w:t>
+      </w:r>
+    </w:p>
+    <w:p>
+      <w:pPr>
+        <w:shd w:fill="1E1E2E" w:val="clear"/>
+        <w:spacing w:after="0"/>
+        <w:ind w:left="160"/>
+      </w:pPr>
+      <w:r>
+        <w:rPr>
+          <w:rFonts w:ascii="Consolas" w:cs="Consolas" w:eastAsia="Consolas" w:hAnsi="Consolas"/>
+          <w:color w:val="D8F0D8"/>
+          <w:sz w:val="17"/>
+          <w:szCs w:val="17"/>
+        </w:rPr>
+        <w:t xml:space="preserve">X-Content-Type-Options: nosniff   X-Frame-Options: SAMEORIGIN</w:t>
+      </w:r>
+    </w:p>
+    <w:p>
+      <w:pPr>
+        <w:shd w:fill="1E1E2E" w:val="clear"/>
+        <w:spacing w:after="0"/>
+        <w:ind w:left="160"/>
+      </w:pPr>
+      <w:r>
+        <w:rPr>
+          <w:rFonts w:ascii="Consolas" w:cs="Consolas" w:eastAsia="Consolas" w:hAnsi="Consolas"/>
+          <w:color w:val="D8F0D8"/>
+          <w:sz w:val="17"/>
+          <w:szCs w:val="17"/>
+        </w:rPr>
+        <w:t xml:space="preserve"> </w:t>
+      </w:r>
+    </w:p>
+    <w:p>
+      <w:pPr>
+        <w:shd w:fill="1E1E2E" w:val="clear"/>
+        <w:spacing w:after="0"/>
+        <w:ind w:left="160"/>
+      </w:pPr>
+      <w:r>
+        <w:rPr>
+          <w:rFonts w:ascii="Consolas" w:cs="Consolas" w:eastAsia="Consolas" w:hAnsi="Consolas"/>
+          <w:color w:val="D8F0D8"/>
+          <w:sz w:val="17"/>
+          <w:szCs w:val="17"/>
+        </w:rPr>
+        <w:t xml:space="preserve"># Rate limit en /auth/token (limite 10/min)</w:t>
+      </w:r>
+    </w:p>
+    <w:p>
+      <w:pPr>
+        <w:shd w:fill="1E1E2E" w:val="clear"/>
+        <w:spacing w:after="0"/>
+        <w:ind w:left="160"/>
+      </w:pPr>
+      <w:r>
+        <w:rPr>
+          <w:rFonts w:ascii="Consolas" w:cs="Consolas" w:eastAsia="Consolas" w:hAnsi="Consolas"/>
+          <w:color w:val="D8F0D8"/>
+          <w:sz w:val="17"/>
+          <w:szCs w:val="17"/>
+        </w:rPr>
+        <w:t xml:space="preserve">401 401 401 401 401 401 401 401 401 401 429 429</w:t>
+      </w:r>
+    </w:p>
+    <w:p>
+      <w:pPr>
+        <w:shd w:fill="1E1E2E" w:val="clear"/>
+        <w:spacing w:after="0"/>
+        <w:ind w:left="160"/>
+      </w:pPr>
+      <w:r>
+        <w:rPr>
+          <w:rFonts w:ascii="Consolas" w:cs="Consolas" w:eastAsia="Consolas" w:hAnsi="Consolas"/>
+          <w:color w:val="D8F0D8"/>
+          <w:sz w:val="17"/>
+          <w:szCs w:val="17"/>
+        </w:rPr>
+        <w:t xml:space="preserve"> </w:t>
+      </w:r>
+    </w:p>
+    <w:p>
+      <w:pPr>
+        <w:shd w:fill="1E1E2E" w:val="clear"/>
+        <w:spacing w:after="0"/>
+        <w:ind w:left="160"/>
+      </w:pPr>
+      <w:r>
+        <w:rPr>
+          <w:rFonts w:ascii="Consolas" w:cs="Consolas" w:eastAsia="Consolas" w:hAnsi="Consolas"/>
+          <w:color w:val="D8F0D8"/>
+          <w:sz w:val="17"/>
+          <w:szCs w:val="17"/>
+        </w:rPr>
+        <w:t xml:space="preserve"># Autorizacion por pais: token CO pidiendo VE -&gt; 403</w:t>
+      </w:r>
+    </w:p>
+    <w:p>
+      <w:pPr>
+        <w:shd w:fill="1E1E2E" w:val="clear"/>
+        <w:spacing w:after="0"/>
+        <w:ind w:left="160"/>
+      </w:pPr>
+      <w:r>
+        <w:rPr>
+          <w:rFonts w:ascii="Consolas" w:cs="Consolas" w:eastAsia="Consolas" w:hAnsi="Consolas"/>
+          <w:color w:val="D8F0D8"/>
+          <w:sz w:val="17"/>
+          <w:szCs w:val="17"/>
+        </w:rPr>
+        <w:t xml:space="preserve"># Payload cifrado: POST RequestJson -&gt; 201 { "ResponseJson": "U2FsdGVkX1+..." }</w:t>
+      </w:r>
+    </w:p>
+    <w:p>
+      <w:pPr>
+        <w:shd w:fill="1E1E2E" w:val="clear"/>
+        <w:spacing w:after="0"/>
+        <w:ind w:left="160"/>
+      </w:pPr>
+      <w:r>
+        <w:rPr>
+          <w:rFonts w:ascii="Consolas" w:cs="Consolas" w:eastAsia="Consolas" w:hAnsi="Consolas"/>
+          <w:color w:val="D8F0D8"/>
+          <w:sz w:val="17"/>
+          <w:szCs w:val="17"/>
+        </w:rPr>
+        <w:t xml:space="preserve">#   descifrado -&gt; {"idNumber":"77777777","message":"TRANSACCION EXITOSA"}</w:t>
+      </w:r>
+    </w:p>
+    <w:p>
+      <w:pPr>
+        <w:shd w:fill="1E1E2E" w:val="clear"/>
+        <w:spacing w:after="0"/>
+        <w:ind w:left="160"/>
+      </w:pPr>
+      <w:r>
+        <w:rPr>
+          <w:rFonts w:ascii="Consolas" w:cs="Consolas" w:eastAsia="Consolas" w:hAnsi="Consolas"/>
+          <w:color w:val="D8F0D8"/>
+          <w:sz w:val="17"/>
+          <w:szCs w:val="17"/>
+        </w:rPr>
+        <w:t xml:space="preserve"># Cipher invalido -&gt; 400</w:t>
+      </w:r>
+    </w:p>
+    <w:p>
+      <w:pPr>
+        <w:shd w:fill="1E1E2E" w:val="clear"/>
+        <w:spacing w:after="0"/>
+        <w:ind w:left="160"/>
+      </w:pPr>
+      <w:r>
+        <w:rPr>
+          <w:rFonts w:ascii="Consolas" w:cs="Consolas" w:eastAsia="Consolas" w:hAnsi="Consolas"/>
+          <w:color w:val="D8F0D8"/>
+          <w:sz w:val="17"/>
+          <w:szCs w:val="17"/>
+        </w:rPr>
+        <w:t xml:space="preserve"> </w:t>
+      </w:r>
+    </w:p>
+    <w:p>
+      <w:pPr>
+        <w:shd w:fill="1E1E2E" w:val="clear"/>
+        <w:spacing w:after="0"/>
+        <w:ind w:left="160"/>
+      </w:pPr>
+      <w:r>
+        <w:rPr>
+          <w:rFonts w:ascii="Consolas" w:cs="Consolas" w:eastAsia="Consolas" w:hAnsi="Consolas"/>
+          <w:color w:val="D8F0D8"/>
+          <w:sz w:val="17"/>
+          <w:szCs w:val="17"/>
+        </w:rPr>
+        <w:t xml:space="preserve"># Fix #5 (orden de guards): sin token, cualquier pais -&gt; 401 (ya no enumera)</w:t>
+      </w:r>
+    </w:p>
+    <w:p>
+      <w:pPr>
+        <w:shd w:fill="1E1E2E" w:val="clear"/>
+        <w:spacing w:after="0"/>
+        <w:ind w:left="160"/>
+      </w:pPr>
+      <w:r>
+        <w:rPr>
+          <w:rFonts w:ascii="Consolas" w:cs="Consolas" w:eastAsia="Consolas" w:hAnsi="Consolas"/>
+          <w:color w:val="D8F0D8"/>
+          <w:sz w:val="17"/>
+          <w:szCs w:val="17"/>
+        </w:rPr>
+        <w:t xml:space="preserve">sin token + VE -&gt; 401   sin token + AR -&gt; 401   sin token + sin header -&gt; 401</w:t>
+      </w:r>
+    </w:p>
+    <w:p>
+      <w:pPr>
+        <w:spacing w:after="120"/>
+      </w:pPr>
+      <w:r>
+        <w:rPr>
+          <w:rFonts w:ascii="Arial" w:cs="Arial" w:eastAsia="Arial" w:hAnsi="Arial"/>
+          <w:sz w:val="22"/>
+          <w:szCs w:val="22"/>
+        </w:rPr>
+        <w:t xml:space="preserve">Cobertura de pruebas: 79 unitarias + 15 e2e verdes; cobertura de líneas ~98%, ramas ~86% (supera el quality gate de SonarQube ≥80%).</w:t>
+      </w:r>
+    </w:p>
+    <w:p>
+      <w:pPr>
+        <w:pStyle w:val="Heading1"/>
+        <w:spacing w:after="140" w:before="280"/>
+      </w:pPr>
+      <w:r>
+        <w:rPr>
+          <w:rFonts w:ascii="Arial" w:cs="Arial" w:eastAsia="Arial" w:hAnsi="Arial"/>
+          <w:b/>
+          <w:bCs/>
+          <w:color w:val="002858"/>
+          <w:sz w:val="28"/>
+          <w:szCs w:val="28"/>
+        </w:rPr>
+        <w:t xml:space="preserve">8. Recomendaciones</w:t>
       </w:r>
     </w:p>
     <w:p>
@@ -2471,7 +3007,7 @@
           <w:sz w:val="22"/>
           <w:szCs w:val="22"/>
         </w:rPr>
-        <w:t xml:space="preserve">Impacto real: bajo — solo revela la lista de países habilitados (información poco sensible), no datos de empleados.</w:t>
+        <w:t xml:space="preserve">Mantener la disciplina de que ninguna operación con cédula use verbo con id en la URL (todo por POST con body).</w:t>
       </w:r>
     </w:p>
     <w:p>
@@ -2489,7 +3025,61 @@
           <w:sz w:val="22"/>
           <w:szCs w:val="22"/>
         </w:rPr>
-        <w:t xml:space="preserve">Mitigación propuesta: convertir el módulo de tenancy de middleware a guard, para que la autenticación ocurra primero. No implementado aún porque altera el orden de códigos de respuesta documentado; requiere validación con el equipo.</w:t>
+        <w:t xml:space="preserve">Rotación periódica de llaves: par RSA del JWT y passphrase de payload (PAYLOAD_ENCRYPTION_KEY) en Secret Manager.</w:t>
+      </w:r>
+    </w:p>
+    <w:p>
+      <w:pPr>
+        <w:pStyle w:val="ListParagraph"/>
+        <w:numPr>
+          <w:ilvl w:val="0"/>
+          <w:numId w:val="2"/>
+        </w:numPr>
+        <w:spacing w:after="80"/>
+      </w:pPr>
+      <w:r>
+        <w:rPr>
+          <w:rFonts w:ascii="Arial" w:cs="Arial" w:eastAsia="Arial" w:hAnsi="Arial"/>
+          <w:sz w:val="22"/>
+          <w:szCs w:val="22"/>
+        </w:rPr>
+        <w:t xml:space="preserve">Confirmar TDE (cifrado en reposo) en la BD Oracle espejo con el DBA.</w:t>
+      </w:r>
+    </w:p>
+    <w:p>
+      <w:pPr>
+        <w:pStyle w:val="ListParagraph"/>
+        <w:numPr>
+          <w:ilvl w:val="0"/>
+          <w:numId w:val="2"/>
+        </w:numPr>
+        <w:spacing w:after="80"/>
+      </w:pPr>
+      <w:r>
+        <w:rPr>
+          <w:rFonts w:ascii="Arial" w:cs="Arial" w:eastAsia="Arial" w:hAnsi="Arial"/>
+          <w:sz w:val="22"/>
+          <w:szCs w:val="22"/>
+        </w:rPr>
+        <w:t xml:space="preserve">Asegurar que el servicio nunca se exponga sin TLS (solo detrás de Cloud Run / balanceador con HTTPS).</w:t>
+      </w:r>
+    </w:p>
+    <w:p>
+      <w:pPr>
+        <w:pStyle w:val="ListParagraph"/>
+        <w:numPr>
+          <w:ilvl w:val="0"/>
+          <w:numId w:val="2"/>
+        </w:numPr>
+        <w:spacing w:after="80"/>
+      </w:pPr>
+      <w:r>
+        <w:rPr>
+          <w:rFonts w:ascii="Arial" w:cs="Arial" w:eastAsia="Arial" w:hAnsi="Arial"/>
+          <w:sz w:val="22"/>
+          <w:szCs w:val="22"/>
+        </w:rPr>
+        <w:t xml:space="preserve">Evaluar acortar el TTL del token o añadir revocación si el modelo de amenaza lo requiere (hoy 12h por premisa).</w:t>
       </w:r>
     </w:p>
     <w:p>
@@ -2506,7 +3096,7 @@
           <w:sz w:val="28"/>
           <w:szCs w:val="28"/>
         </w:rPr>
-        <w:t xml:space="preserve">7. Evidencia de verificación</w:t>
+        <w:t xml:space="preserve">9. Conclusión</w:t>
       </w:r>
     </w:p>
     <w:p>
@@ -2519,333 +3109,7 @@
           <w:sz w:val="22"/>
           <w:szCs w:val="22"/>
         </w:rPr>
-        <w:t xml:space="preserve">Verificado en runtime y por pruebas automatizadas:</w:t>
-      </w:r>
-    </w:p>
-    <w:p>
-      <w:pPr>
-        <w:shd w:fill="1E1E2E" w:val="clear"/>
-        <w:spacing w:after="0"/>
-        <w:ind w:left="160"/>
-      </w:pPr>
-      <w:r>
-        <w:rPr>
-          <w:rFonts w:ascii="Consolas" w:cs="Consolas" w:eastAsia="Consolas" w:hAnsi="Consolas"/>
-          <w:color w:val="D8F0D8"/>
-          <w:sz w:val="17"/>
-          <w:szCs w:val="17"/>
-        </w:rPr>
-        <w:t xml:space="preserve"># Cabeceras de seguridad (helmet)</w:t>
-      </w:r>
-    </w:p>
-    <w:p>
-      <w:pPr>
-        <w:shd w:fill="1E1E2E" w:val="clear"/>
-        <w:spacing w:after="0"/>
-        <w:ind w:left="160"/>
-      </w:pPr>
-      <w:r>
-        <w:rPr>
-          <w:rFonts w:ascii="Consolas" w:cs="Consolas" w:eastAsia="Consolas" w:hAnsi="Consolas"/>
-          <w:color w:val="D8F0D8"/>
-          <w:sz w:val="17"/>
-          <w:szCs w:val="17"/>
-        </w:rPr>
-        <w:t xml:space="preserve">Strict-Transport-Security: max-age=31536000; includeSubDomains; preload</w:t>
-      </w:r>
-    </w:p>
-    <w:p>
-      <w:pPr>
-        <w:shd w:fill="1E1E2E" w:val="clear"/>
-        <w:spacing w:after="0"/>
-        <w:ind w:left="160"/>
-      </w:pPr>
-      <w:r>
-        <w:rPr>
-          <w:rFonts w:ascii="Consolas" w:cs="Consolas" w:eastAsia="Consolas" w:hAnsi="Consolas"/>
-          <w:color w:val="D8F0D8"/>
-          <w:sz w:val="17"/>
-          <w:szCs w:val="17"/>
-        </w:rPr>
-        <w:t xml:space="preserve">X-Content-Type-Options: nosniff   X-Frame-Options: SAMEORIGIN</w:t>
-      </w:r>
-    </w:p>
-    <w:p>
-      <w:pPr>
-        <w:shd w:fill="1E1E2E" w:val="clear"/>
-        <w:spacing w:after="0"/>
-        <w:ind w:left="160"/>
-      </w:pPr>
-      <w:r>
-        <w:rPr>
-          <w:rFonts w:ascii="Consolas" w:cs="Consolas" w:eastAsia="Consolas" w:hAnsi="Consolas"/>
-          <w:color w:val="D8F0D8"/>
-          <w:sz w:val="17"/>
-          <w:szCs w:val="17"/>
-        </w:rPr>
-        <w:t xml:space="preserve"> </w:t>
-      </w:r>
-    </w:p>
-    <w:p>
-      <w:pPr>
-        <w:shd w:fill="1E1E2E" w:val="clear"/>
-        <w:spacing w:after="0"/>
-        <w:ind w:left="160"/>
-      </w:pPr>
-      <w:r>
-        <w:rPr>
-          <w:rFonts w:ascii="Consolas" w:cs="Consolas" w:eastAsia="Consolas" w:hAnsi="Consolas"/>
-          <w:color w:val="D8F0D8"/>
-          <w:sz w:val="17"/>
-          <w:szCs w:val="17"/>
-        </w:rPr>
-        <w:t xml:space="preserve"># Rate limit en /auth/token (limite 10/min)</w:t>
-      </w:r>
-    </w:p>
-    <w:p>
-      <w:pPr>
-        <w:shd w:fill="1E1E2E" w:val="clear"/>
-        <w:spacing w:after="0"/>
-        <w:ind w:left="160"/>
-      </w:pPr>
-      <w:r>
-        <w:rPr>
-          <w:rFonts w:ascii="Consolas" w:cs="Consolas" w:eastAsia="Consolas" w:hAnsi="Consolas"/>
-          <w:color w:val="D8F0D8"/>
-          <w:sz w:val="17"/>
-          <w:szCs w:val="17"/>
-        </w:rPr>
-        <w:t xml:space="preserve">401 401 401 401 401 401 401 401 401 401 429 429</w:t>
-      </w:r>
-    </w:p>
-    <w:p>
-      <w:pPr>
-        <w:shd w:fill="1E1E2E" w:val="clear"/>
-        <w:spacing w:after="0"/>
-        <w:ind w:left="160"/>
-      </w:pPr>
-      <w:r>
-        <w:rPr>
-          <w:rFonts w:ascii="Consolas" w:cs="Consolas" w:eastAsia="Consolas" w:hAnsi="Consolas"/>
-          <w:color w:val="D8F0D8"/>
-          <w:sz w:val="17"/>
-          <w:szCs w:val="17"/>
-        </w:rPr>
-        <w:t xml:space="preserve"> </w:t>
-      </w:r>
-    </w:p>
-    <w:p>
-      <w:pPr>
-        <w:shd w:fill="1E1E2E" w:val="clear"/>
-        <w:spacing w:after="0"/>
-        <w:ind w:left="160"/>
-      </w:pPr>
-      <w:r>
-        <w:rPr>
-          <w:rFonts w:ascii="Consolas" w:cs="Consolas" w:eastAsia="Consolas" w:hAnsi="Consolas"/>
-          <w:color w:val="D8F0D8"/>
-          <w:sz w:val="17"/>
-          <w:szCs w:val="17"/>
-        </w:rPr>
-        <w:t xml:space="preserve"># Autorizacion por pais: token CO pidiendo VE -&gt; 403</w:t>
-      </w:r>
-    </w:p>
-    <w:p>
-      <w:pPr>
-        <w:shd w:fill="1E1E2E" w:val="clear"/>
-        <w:spacing w:after="0"/>
-        <w:ind w:left="160"/>
-      </w:pPr>
-      <w:r>
-        <w:rPr>
-          <w:rFonts w:ascii="Consolas" w:cs="Consolas" w:eastAsia="Consolas" w:hAnsi="Consolas"/>
-          <w:color w:val="D8F0D8"/>
-          <w:sz w:val="17"/>
-          <w:szCs w:val="17"/>
-        </w:rPr>
-        <w:t xml:space="preserve"># Payload cifrado: POST RequestJson -&gt; 201 { "ResponseJson": "U2FsdGVkX1+..." }</w:t>
-      </w:r>
-    </w:p>
-    <w:p>
-      <w:pPr>
-        <w:shd w:fill="1E1E2E" w:val="clear"/>
-        <w:spacing w:after="0"/>
-        <w:ind w:left="160"/>
-      </w:pPr>
-      <w:r>
-        <w:rPr>
-          <w:rFonts w:ascii="Consolas" w:cs="Consolas" w:eastAsia="Consolas" w:hAnsi="Consolas"/>
-          <w:color w:val="D8F0D8"/>
-          <w:sz w:val="17"/>
-          <w:szCs w:val="17"/>
-        </w:rPr>
-        <w:t xml:space="preserve">#   descifrado -&gt; {"idNumber":"77777777","message":"TRANSACCION EXITOSA"}</w:t>
-      </w:r>
-    </w:p>
-    <w:p>
-      <w:pPr>
-        <w:shd w:fill="1E1E2E" w:val="clear"/>
-        <w:spacing w:after="0"/>
-        <w:ind w:left="160"/>
-      </w:pPr>
-      <w:r>
-        <w:rPr>
-          <w:rFonts w:ascii="Consolas" w:cs="Consolas" w:eastAsia="Consolas" w:hAnsi="Consolas"/>
-          <w:color w:val="D8F0D8"/>
-          <w:sz w:val="17"/>
-          <w:szCs w:val="17"/>
-        </w:rPr>
-        <w:t xml:space="preserve"># Cipher invalido -&gt; 400</w:t>
-      </w:r>
-    </w:p>
-    <w:p>
-      <w:pPr>
-        <w:spacing w:after="120"/>
-      </w:pPr>
-      <w:r>
-        <w:rPr>
-          <w:rFonts w:ascii="Arial" w:cs="Arial" w:eastAsia="Arial" w:hAnsi="Arial"/>
-          <w:sz w:val="22"/>
-          <w:szCs w:val="22"/>
-        </w:rPr>
-        <w:t xml:space="preserve">Cobertura de pruebas: 79 unitarias + 15 e2e verdes; cobertura de líneas ~98%, ramas ~86% (supera el quality gate de SonarQube ≥80%).</w:t>
-      </w:r>
-    </w:p>
-    <w:p>
-      <w:pPr>
-        <w:pStyle w:val="Heading1"/>
-        <w:spacing w:after="140" w:before="280"/>
-      </w:pPr>
-      <w:r>
-        <w:rPr>
-          <w:rFonts w:ascii="Arial" w:cs="Arial" w:eastAsia="Arial" w:hAnsi="Arial"/>
-          <w:b/>
-          <w:bCs/>
-          <w:color w:val="002858"/>
-          <w:sz w:val="28"/>
-          <w:szCs w:val="28"/>
-        </w:rPr>
-        <w:t xml:space="preserve">8. Recomendaciones</w:t>
-      </w:r>
-    </w:p>
-    <w:p>
-      <w:pPr>
-        <w:pStyle w:val="ListParagraph"/>
-        <w:numPr>
-          <w:ilvl w:val="0"/>
-          <w:numId w:val="2"/>
-        </w:numPr>
-        <w:spacing w:after="80"/>
-      </w:pPr>
-      <w:r>
-        <w:rPr>
-          <w:rFonts w:ascii="Arial" w:cs="Arial" w:eastAsia="Arial" w:hAnsi="Arial"/>
-          <w:sz w:val="22"/>
-          <w:szCs w:val="22"/>
-        </w:rPr>
-        <w:t xml:space="preserve">Resolver el riesgo residual #5 (tenancy como guard) tras validar el cambio de contrato con el equipo.</w:t>
-      </w:r>
-    </w:p>
-    <w:p>
-      <w:pPr>
-        <w:pStyle w:val="ListParagraph"/>
-        <w:numPr>
-          <w:ilvl w:val="0"/>
-          <w:numId w:val="2"/>
-        </w:numPr>
-        <w:spacing w:after="80"/>
-      </w:pPr>
-      <w:r>
-        <w:rPr>
-          <w:rFonts w:ascii="Arial" w:cs="Arial" w:eastAsia="Arial" w:hAnsi="Arial"/>
-          <w:sz w:val="22"/>
-          <w:szCs w:val="22"/>
-        </w:rPr>
-        <w:t xml:space="preserve">Rotación periódica de llaves: par RSA del JWT y passphrase de payload (PAYLOAD_ENCRYPTION_KEY) en Secret Manager.</w:t>
-      </w:r>
-    </w:p>
-    <w:p>
-      <w:pPr>
-        <w:pStyle w:val="ListParagraph"/>
-        <w:numPr>
-          <w:ilvl w:val="0"/>
-          <w:numId w:val="2"/>
-        </w:numPr>
-        <w:spacing w:after="80"/>
-      </w:pPr>
-      <w:r>
-        <w:rPr>
-          <w:rFonts w:ascii="Arial" w:cs="Arial" w:eastAsia="Arial" w:hAnsi="Arial"/>
-          <w:sz w:val="22"/>
-          <w:szCs w:val="22"/>
-        </w:rPr>
-        <w:t xml:space="preserve">Confirmar TDE (cifrado en reposo) en la BD Oracle espejo con el DBA.</w:t>
-      </w:r>
-    </w:p>
-    <w:p>
-      <w:pPr>
-        <w:pStyle w:val="ListParagraph"/>
-        <w:numPr>
-          <w:ilvl w:val="0"/>
-          <w:numId w:val="2"/>
-        </w:numPr>
-        <w:spacing w:after="80"/>
-      </w:pPr>
-      <w:r>
-        <w:rPr>
-          <w:rFonts w:ascii="Arial" w:cs="Arial" w:eastAsia="Arial" w:hAnsi="Arial"/>
-          <w:sz w:val="22"/>
-          <w:szCs w:val="22"/>
-        </w:rPr>
-        <w:t xml:space="preserve">Asegurar que el servicio nunca se exponga sin TLS (solo detrás de Cloud Run / balanceador con HTTPS).</w:t>
-      </w:r>
-    </w:p>
-    <w:p>
-      <w:pPr>
-        <w:pStyle w:val="ListParagraph"/>
-        <w:numPr>
-          <w:ilvl w:val="0"/>
-          <w:numId w:val="2"/>
-        </w:numPr>
-        <w:spacing w:after="80"/>
-      </w:pPr>
-      <w:r>
-        <w:rPr>
-          <w:rFonts w:ascii="Arial" w:cs="Arial" w:eastAsia="Arial" w:hAnsi="Arial"/>
-          <w:sz w:val="22"/>
-          <w:szCs w:val="22"/>
-        </w:rPr>
-        <w:t xml:space="preserve">Evaluar acortar el TTL del token o añadir revocación si el modelo de amenaza lo requiere (hoy 12h por premisa).</w:t>
-      </w:r>
-    </w:p>
-    <w:p>
-      <w:pPr>
-        <w:pStyle w:val="Heading1"/>
-        <w:spacing w:after="140" w:before="280"/>
-      </w:pPr>
-      <w:r>
-        <w:rPr>
-          <w:rFonts w:ascii="Arial" w:cs="Arial" w:eastAsia="Arial" w:hAnsi="Arial"/>
-          <w:b/>
-          <w:bCs/>
-          <w:color w:val="002858"/>
-          <w:sz w:val="28"/>
-          <w:szCs w:val="28"/>
-        </w:rPr>
-        <w:t xml:space="preserve">9. Conclusión</w:t>
-      </w:r>
-    </w:p>
-    <w:p>
-      <w:pPr>
-        <w:spacing w:after="120"/>
-      </w:pPr>
-      <w:r>
-        <w:rPr>
-          <w:rFonts w:ascii="Arial" w:cs="Arial" w:eastAsia="Arial" w:hAnsi="Arial"/>
-          <w:sz w:val="22"/>
-          <w:szCs w:val="22"/>
-        </w:rPr>
-        <w:t xml:space="preserve">El Employee API SPI implementa los controles de seguridad esperados para el manejo de PII de empleados. Los 5 hallazgos accionables fueron corregidos y verificados; el requisito P2C de cifrado de payload quedó implementado con crypto-js y probado extremo a extremo. El único riesgo residual es de bajo impacto y está documentado con su mitigación. Se recomienda cerrar el residual y mantener la disciplina de rotación de llaves y despliegue siempre detrás de TLS.</w:t>
+        <w:t xml:space="preserve">El Employee API SPI implementa los controles de seguridad esperados para el manejo de PII de empleados. Los 8 hallazgos fueron corregidos y verificados; el requisito P2C de cifrado de payload quedó implementado con crypto-js y probado extremo a extremo, y la cédula ya no viaja en la URL en ninguna operación. No quedan riesgos residuales abiertos. Se recomienda mantener la disciplina de rotación de llaves, TDE en reposo y despliegue siempre detrás de TLS.</w:t>
       </w:r>
     </w:p>
     <w:sectPr>

</xml_diff>